<commit_message>
Add citation metadata and document citing and licensing
</commit_message>
<xml_diff>
--- a/docs/Rodent-Feeding-Behavior-Manual.docx
+++ b/docs/Rodent-Feeding-Behavior-Manual.docx
@@ -34397,13 +34397,58 @@
           <w:bCs/>
           <w:b/>
         </w:rPr>
-        <w:t xml:space="preserve">How do I cite the methods?</w:t>
-      </w:r>
-      <w:r>
-        <w:t xml:space="preserve"> </w:t>
-      </w:r>
-      <w:r>
-        <w:t xml:space="preserve">The</w:t>
+        <w:t xml:space="preserve">How do I cite the tool and its methods?</w:t>
+      </w:r>
+      <w:r>
+        <w:t xml:space="preserve"> </w:t>
+      </w:r>
+      <w:r>
+        <w:t xml:space="preserve">Cite the software using</w:t>
+      </w:r>
+      <w:r>
+        <w:t xml:space="preserve"> </w:t>
+      </w:r>
+      <w:r>
+        <w:rPr>
+          <w:rStyle w:val="VerbatimChar"/>
+        </w:rPr>
+        <w:t xml:space="preserve">CITATION.cff</w:t>
+      </w:r>
+      <w:r>
+        <w:t xml:space="preserve"> </w:t>
+      </w:r>
+      <w:r>
+        <w:t xml:space="preserve">in the repository (on GitHub:</w:t>
+      </w:r>
+      <w:r>
+        <w:t xml:space="preserve"> </w:t>
+      </w:r>
+      <w:r>
+        <w:rPr>
+          <w:bCs/>
+          <w:b/>
+        </w:rPr>
+        <w:t xml:space="preserve">Cite this repository</w:t>
+      </w:r>
+      <w:r>
+        <w:t xml:space="preserve">), and cite</w:t>
+      </w:r>
+      <w:r>
+        <w:t xml:space="preserve"> </w:t>
+      </w:r>
+      <w:hyperlink r:id="rId20">
+        <w:r>
+          <w:rPr>
+            <w:rStyle w:val="Hyperlink"/>
+          </w:rPr>
+          <w:t xml:space="preserve">SLEAP</w:t>
+        </w:r>
+      </w:hyperlink>
+      <w:r>
+        <w:t xml:space="preserve"> </w:t>
+      </w:r>
+      <w:r>
+        <w:t xml:space="preserve">for the pose estimation. The</w:t>
       </w:r>
       <w:r>
         <w:t xml:space="preserve"> </w:t>
@@ -34437,13 +34482,13 @@
         <w:t xml:space="preserve"> </w:t>
       </w:r>
       <w:r>
-        <w:t xml:space="preserve">chapters give the definitions.</w:t>
-      </w:r>
-      <w:r>
-        <w:t xml:space="preserve"> </w:t>
-      </w:r>
-      <w:r>
-        <w:t xml:space="preserve">Report the code version (commit) and the settings from the run’s</w:t>
+        <w:t xml:space="preserve">chapters give the definitions. Report the code version (commit) and the</w:t>
+      </w:r>
+      <w:r>
+        <w:t xml:space="preserve"> </w:t>
+      </w:r>
+      <w:r>
+        <w:t xml:space="preserve">settings from the run’s</w:t>
       </w:r>
       <w:r>
         <w:t xml:space="preserve"> </w:t>
@@ -34471,6 +34516,42 @@
       </w:r>
       <w:r>
         <w:t xml:space="preserve">.</w:t>
+      </w:r>
+    </w:p>
+    <w:p>
+      <w:pPr>
+        <w:pStyle w:val="BodyText"/>
+      </w:pPr>
+      <w:r>
+        <w:rPr>
+          <w:bCs/>
+          <w:b/>
+        </w:rPr>
+        <w:t xml:space="preserve">Under what license is the tool distributed?</w:t>
+      </w:r>
+      <w:r>
+        <w:t xml:space="preserve"> </w:t>
+      </w:r>
+      <w:r>
+        <w:t xml:space="preserve">BSD 3-Clause (see</w:t>
+      </w:r>
+      <w:r>
+        <w:t xml:space="preserve"> </w:t>
+      </w:r>
+      <w:r>
+        <w:rPr>
+          <w:rStyle w:val="VerbatimChar"/>
+        </w:rPr>
+        <w:t xml:space="preserve">LICENSE</w:t>
+      </w:r>
+      <w:r>
+        <w:t xml:space="preserve">): you may use, modify and redistribute it, in academic or any other work, provided the</w:t>
+      </w:r>
+      <w:r>
+        <w:t xml:space="preserve"> </w:t>
+      </w:r>
+      <w:r>
+        <w:t xml:space="preserve">copyright notice is kept.</w:t>
       </w:r>
     </w:p>
     <w:bookmarkEnd w:id="241"/>

</xml_diff>